<commit_message>
Actualización de la app
</commit_message>
<xml_diff>
--- a/assets/plantilla_informe.docx
+++ b/assets/plantilla_informe.docx
@@ -65,7 +65,7 @@
                     <a:blip r:embed="rId8">
                       <a:extLst>
                         <a:ext uri="{FF2B5EF4-FFF2-40B4-BE49-F238E27FC236}">
-                          <a16:creationId xmlns="" xmlns:o="urn:schemas-microsoft-com:office:office" xmlns:v="urn:schemas-microsoft-com:vml" xmlns:w10="urn:schemas-microsoft-com:office:word" xmlns:w="http://schemas.openxmlformats.org/wordprocessingml/2006/main" xmlns:w16du="http://schemas.microsoft.com/office/word/2023/wordml/word16du" xmlns:a14="http://schemas.microsoft.com/office/drawing/2010/main" xmlns:a16="http://schemas.microsoft.com/office/drawing/2014/main" id="{953A8966-0478-C449-B886-3FEC40D74CF1}"/>
+                          <a16:creationId xmlns:a16="http://schemas.microsoft.com/office/drawing/2014/main" xmlns:a14="http://schemas.microsoft.com/office/drawing/2010/main" xmlns:w16du="http://schemas.microsoft.com/office/word/2023/wordml/word16du" xmlns:w="http://schemas.openxmlformats.org/wordprocessingml/2006/main" xmlns:w10="urn:schemas-microsoft-com:office:word" xmlns:v="urn:schemas-microsoft-com:vml" xmlns:o="urn:schemas-microsoft-com:office:office" xmlns="" id="{953A8966-0478-C449-B886-3FEC40D74CF1}"/>
                         </a:ext>
                       </a:extLst>
                     </a:blip>
@@ -146,7 +146,6 @@
           <w:color w:val="002060"/>
           <w:sz w:val="36"/>
           <w:szCs w:val="32"/>
-          <w:highlight w:val="yellow"/>
         </w:rPr>
       </w:pPr>
       <w:r>
@@ -156,7 +155,6 @@
           <w:color w:val="002060"/>
           <w:sz w:val="36"/>
           <w:szCs w:val="32"/>
-          <w:highlight w:val="yellow"/>
         </w:rPr>
         <w:t xml:space="preserve">FACULTAD DE </w:t>
       </w:r>
@@ -167,7 +165,6 @@
           <w:color w:val="002060"/>
           <w:sz w:val="36"/>
           <w:szCs w:val="32"/>
-          <w:highlight w:val="yellow"/>
         </w:rPr>
         <w:t>INGENIERÍA Y ARQUITECTURA</w:t>
       </w:r>
@@ -192,7 +189,6 @@
           <w:color w:val="002060"/>
           <w:sz w:val="32"/>
           <w:szCs w:val="32"/>
-          <w:highlight w:val="yellow"/>
         </w:rPr>
         <w:t xml:space="preserve">Escuela Profesional de </w:t>
       </w:r>
@@ -203,7 +199,6 @@
           <w:color w:val="002060"/>
           <w:sz w:val="32"/>
           <w:szCs w:val="32"/>
-          <w:highlight w:val="yellow"/>
         </w:rPr>
         <w:t>Ingeniería de Sistemas</w:t>
       </w:r>
@@ -305,7 +300,6 @@
           <w:color w:val="002060"/>
           <w:sz w:val="40"/>
           <w:szCs w:val="40"/>
-          <w:highlight w:val="yellow"/>
           <w:lang w:val="es-419"/>
         </w:rPr>
         <w:t>PLAN COLOQUIOS Y JORNADAS DE INVESTIGACIÓN 2025</w:t>
@@ -398,7 +392,6 @@
           <w:color w:val="001F5F"/>
           <w:sz w:val="28"/>
           <w:szCs w:val="28"/>
-          <w:highlight w:val="yellow"/>
           <w:lang w:val="es-ES"/>
         </w:rPr>
         <w:t>EP. Ingeniería de Sistemas</w:t>
@@ -440,7 +433,6 @@
           <w:color w:val="001F5F"/>
           <w:sz w:val="32"/>
           <w:szCs w:val="32"/>
-          <w:highlight w:val="yellow"/>
           <w:lang w:val="es-419"/>
         </w:rPr>
       </w:pPr>
@@ -452,7 +444,6 @@
           <w:color w:val="001F5F"/>
           <w:sz w:val="32"/>
           <w:szCs w:val="32"/>
-          <w:highlight w:val="yellow"/>
         </w:rPr>
         <w:t>UPeU – Campus Juliaca</w:t>
       </w:r>
@@ -480,7 +471,6 @@
           <w:color w:val="001F5F"/>
           <w:sz w:val="32"/>
           <w:szCs w:val="32"/>
-          <w:highlight w:val="yellow"/>
         </w:rPr>
         <w:t>2025</w:t>
       </w:r>
@@ -621,18 +611,6 @@
         </w:rPr>
         <w:t xml:space="preserve"> </w:t>
       </w:r>
-      <w:r>
-        <w:rPr>
-          <w:rFonts w:ascii="Segoe UI" w:hAnsi="Segoe UI" w:cs="Segoe UI"/>
-          <w:b/>
-          <w:bCs/>
-          <w:color w:val="002060"/>
-          <w:sz w:val="24"/>
-          <w:szCs w:val="24"/>
-          <w:lang w:val="es-ES"/>
-        </w:rPr>
-        <w:t>(Generado por el sistema)</w:t>
-      </w:r>
     </w:p>
     <w:p>
       <w:pPr>
@@ -663,7 +641,6 @@
         <w:rPr>
           <w:rFonts w:ascii="Segoe UI" w:hAnsi="Segoe UI" w:cs="Segoe UI"/>
           <w:b/>
-          <w:highlight w:val="yellow"/>
         </w:rPr>
         <w:t>Ingeniería de Sistemas</w:t>
       </w:r>
@@ -677,7 +654,6 @@
         <w:rPr>
           <w:rFonts w:ascii="Segoe UI" w:hAnsi="Segoe UI" w:cs="Segoe UI"/>
           <w:b/>
-          <w:highlight w:val="yellow"/>
         </w:rPr>
         <w:t>Facultad de Ingeniería y Arquitectura</w:t>
       </w:r>
@@ -691,7 +667,6 @@
         <w:rPr>
           <w:rFonts w:ascii="Segoe UI" w:hAnsi="Segoe UI" w:cs="Segoe UI"/>
           <w:b/>
-          <w:highlight w:val="yellow"/>
         </w:rPr>
         <w:t>Campus Juliaca</w:t>
       </w:r>
@@ -713,35 +688,20 @@
         <w:rPr>
           <w:rFonts w:ascii="Segoe UI" w:hAnsi="Segoe UI" w:cs="Segoe UI"/>
         </w:rPr>
-        <w:t xml:space="preserve"> 30220, los estándares del SINEACE y las políticas institucionales de investigación, desarrolló la </w:t>
-      </w:r>
-      <w:r>
-        <w:rPr>
-          <w:rFonts w:ascii="Segoe UI" w:hAnsi="Segoe UI" w:cs="Segoe UI"/>
-          <w:highlight w:val="yellow"/>
-        </w:rPr>
-        <w:t>"</w:t>
+        <w:t xml:space="preserve"> 30220, los estándares del SINEACE y las políticas institucionales de investigación, desarrolló la "</w:t>
       </w:r>
       <w:r>
         <w:rPr>
           <w:rFonts w:ascii="Segoe UI" w:hAnsi="Segoe UI" w:cs="Segoe UI"/>
           <w:b/>
-          <w:highlight w:val="yellow"/>
         </w:rPr>
         <w:t>XXII Jornada Científica de Investigación e Innovación de Ingeniería de Sistemas</w:t>
       </w:r>
       <w:r>
         <w:rPr>
           <w:rFonts w:ascii="Segoe UI" w:hAnsi="Segoe UI" w:cs="Segoe UI"/>
-          <w:highlight w:val="yellow"/>
-        </w:rPr>
-        <w:t>",</w:t>
-      </w:r>
-      <w:r>
-        <w:rPr>
-          <w:rFonts w:ascii="Segoe UI" w:hAnsi="Segoe UI" w:cs="Segoe UI"/>
-        </w:rPr>
-        <w:t xml:space="preserve"> con el propósito de difundir los resultados de investigación generados por docentes y estudiantes, fomentar el intercambio académico y fortalecer la cultura investigativa en la comunidad universitaria, concibiéndose como un espacio académico-científico-tecnológico para la socialización de proyectos de investigación, </w:t>
+        </w:rPr>
+        <w:t xml:space="preserve">", con el propósito de difundir los resultados de investigación generados por docentes y estudiantes, fomentar el intercambio académico y fortalecer la cultura investigativa en la comunidad universitaria, concibiéndose como un espacio académico-científico-tecnológico para la socialización de proyectos de investigación, </w:t>
       </w:r>
       <w:r>
         <w:rPr>
@@ -835,7 +795,7 @@
           <w:szCs w:val="24"/>
           <w:lang w:val="es-ES"/>
         </w:rPr>
-        <w:t xml:space="preserve"> (Generado por el sistema)</w:t>
+        <w:t xml:space="preserve"> </w:t>
       </w:r>
     </w:p>
     <w:p>
@@ -895,19 +855,12 @@
         <w:rPr>
           <w:rFonts w:ascii="Segoe UI" w:hAnsi="Segoe UI" w:cs="Segoe UI"/>
         </w:rPr>
-        <w:t xml:space="preserve">Desarrollar las competencias del </w:t>
-      </w:r>
-      <w:r>
-        <w:rPr>
-          <w:rFonts w:ascii="Segoe UI" w:hAnsi="Segoe UI" w:cs="Segoe UI"/>
-        </w:rPr>
-        <w:t xml:space="preserve">estudiante de </w:t>
+        <w:t xml:space="preserve">Desarrollar las competencias del estudiante de </w:t>
       </w:r>
       <w:r>
         <w:rPr>
           <w:rFonts w:ascii="Segoe UI" w:hAnsi="Segoe UI" w:cs="Segoe UI"/>
           <w:b/>
-          <w:highlight w:val="yellow"/>
         </w:rPr>
         <w:t>Ingeniería de Sistemas</w:t>
       </w:r>
@@ -915,13 +868,7 @@
         <w:rPr>
           <w:rFonts w:ascii="Segoe UI" w:hAnsi="Segoe UI" w:cs="Segoe UI"/>
         </w:rPr>
-        <w:t xml:space="preserve"> </w:t>
-      </w:r>
-      <w:r>
-        <w:rPr>
-          <w:rFonts w:ascii="Segoe UI" w:hAnsi="Segoe UI" w:cs="Segoe UI"/>
-        </w:rPr>
-        <w:t>a través del desarrollo de la investigación formativa, partiendo desde el primer año de sus estudios, hasta el culmino de su carrera profesional, en cumplimiento de los lineamientos de investigación que la escuela mantiene.</w:t>
+        <w:t xml:space="preserve"> a través del desarrollo de la investigación formativa, partiendo desde el primer año de sus estudios, hasta el culmino de su carrera profesional, en cumplimiento de los lineamientos de investigación que la escuela mantiene.</w:t>
       </w:r>
     </w:p>
     <w:p>
@@ -1085,18 +1032,6 @@
         </w:rPr>
         <w:t xml:space="preserve"> </w:t>
       </w:r>
-      <w:r>
-        <w:rPr>
-          <w:rFonts w:ascii="Segoe UI" w:hAnsi="Segoe UI" w:cs="Segoe UI"/>
-          <w:b/>
-          <w:bCs/>
-          <w:color w:val="002060"/>
-          <w:sz w:val="24"/>
-          <w:szCs w:val="24"/>
-          <w:lang w:val="es-ES"/>
-        </w:rPr>
-        <w:t>(Generado por el sistema)</w:t>
-      </w:r>
     </w:p>
     <w:p>
       <w:pPr>
@@ -1115,16 +1050,6 @@
           <w:lang w:val="es-419"/>
         </w:rPr>
         <w:t xml:space="preserve">La </w:t>
-      </w:r>
-      <w:r>
-        <w:rPr>
-          <w:rFonts w:ascii="Segoe UI" w:hAnsi="Segoe UI" w:cs="Segoe UI"/>
-          <w:b/>
-          <w:color w:val="000000" w:themeColor="text1"/>
-          <w:highlight w:val="yellow"/>
-          <w:lang w:val="es-419"/>
-        </w:rPr>
-        <w:t>"XXII Jornada Científica de Investigación e Innovación de Ingeniería de Sistemas"</w:t>
       </w:r>
       <w:r>
         <w:rPr>
@@ -1133,7 +1058,7 @@
           <w:color w:val="000000" w:themeColor="text1"/>
           <w:lang w:val="es-419"/>
         </w:rPr>
-        <w:t xml:space="preserve"> </w:t>
+        <w:t xml:space="preserve">"XXII Jornada Científica de Investigación e Innovación de Ingeniería de Sistemas" </w:t>
       </w:r>
       <w:r>
         <w:rPr>
@@ -1141,25 +1066,7 @@
           <w:color w:val="000000" w:themeColor="text1"/>
           <w:lang w:val="es-419"/>
         </w:rPr>
-        <w:t xml:space="preserve">estuvo dirigida a estudiantes de </w:t>
-      </w:r>
-      <w:r>
-        <w:rPr>
-          <w:rFonts w:ascii="Segoe UI" w:hAnsi="Segoe UI" w:cs="Segoe UI"/>
-          <w:color w:val="000000" w:themeColor="text1"/>
-          <w:lang w:val="es-419"/>
-        </w:rPr>
-        <w:t xml:space="preserve">la Escuela Profesional de </w:t>
-      </w:r>
-      <w:r>
-        <w:rPr>
-          <w:rFonts w:ascii="Segoe UI" w:hAnsi="Segoe UI" w:cs="Segoe UI"/>
-          <w:b/>
-          <w:color w:val="000000" w:themeColor="text1"/>
-          <w:highlight w:val="yellow"/>
-          <w:lang w:val="es-419"/>
-        </w:rPr>
-        <w:t>Ingeniería de Sistemas</w:t>
+        <w:t xml:space="preserve">estuvo dirigida a estudiantes de la Escuela Profesional de </w:t>
       </w:r>
       <w:r>
         <w:rPr>
@@ -1168,7 +1075,7 @@
           <w:color w:val="000000" w:themeColor="text1"/>
           <w:lang w:val="es-419"/>
         </w:rPr>
-        <w:t>,</w:t>
+        <w:t>Ingeniería de Sistemas,</w:t>
       </w:r>
       <w:r>
         <w:rPr>
@@ -1176,48 +1083,30 @@
           <w:color w:val="000000" w:themeColor="text1"/>
           <w:lang w:val="es-419"/>
         </w:rPr>
-        <w:t xml:space="preserve"> </w:t>
-      </w:r>
-      <w:r>
-        <w:rPr>
-          <w:rFonts w:ascii="Segoe UI" w:hAnsi="Segoe UI" w:cs="Segoe UI"/>
+        <w:t xml:space="preserve"> desarrollándose en modalidad presencial en el </w:t>
+      </w:r>
+      <w:r>
+        <w:rPr>
+          <w:rFonts w:ascii="Segoe UI" w:hAnsi="Segoe UI" w:cs="Segoe UI"/>
+          <w:b/>
           <w:color w:val="000000" w:themeColor="text1"/>
           <w:lang w:val="es-419"/>
         </w:rPr>
-        <w:t xml:space="preserve">desarrollándose en modalidad presencial en el </w:t>
+        <w:t>Campus Juliaca</w:t>
+      </w:r>
+      <w:r>
+        <w:rPr>
+          <w:rFonts w:ascii="Segoe UI" w:hAnsi="Segoe UI" w:cs="Segoe UI"/>
+          <w:color w:val="000000" w:themeColor="text1"/>
+          <w:lang w:val="es-419"/>
+        </w:rPr>
+        <w:t xml:space="preserve"> el </w:t>
       </w:r>
       <w:r>
         <w:rPr>
           <w:rFonts w:ascii="Segoe UI" w:hAnsi="Segoe UI" w:cs="Segoe UI"/>
           <w:b/>
           <w:color w:val="000000" w:themeColor="text1"/>
-          <w:highlight w:val="yellow"/>
-          <w:lang w:val="es-419"/>
-        </w:rPr>
-        <w:t>Campus Juliaca</w:t>
-      </w:r>
-      <w:r>
-        <w:rPr>
-          <w:rFonts w:ascii="Segoe UI" w:hAnsi="Segoe UI" w:cs="Segoe UI"/>
-          <w:color w:val="000000" w:themeColor="text1"/>
-          <w:lang w:val="es-419"/>
-        </w:rPr>
-        <w:t xml:space="preserve"> </w:t>
-      </w:r>
-      <w:r>
-        <w:rPr>
-          <w:rFonts w:ascii="Segoe UI" w:hAnsi="Segoe UI" w:cs="Segoe UI"/>
-          <w:color w:val="000000" w:themeColor="text1"/>
-          <w:lang w:val="es-419"/>
-        </w:rPr>
-        <w:t xml:space="preserve">el </w:t>
-      </w:r>
-      <w:r>
-        <w:rPr>
-          <w:rFonts w:ascii="Segoe UI" w:hAnsi="Segoe UI" w:cs="Segoe UI"/>
-          <w:b/>
-          <w:color w:val="000000" w:themeColor="text1"/>
-          <w:highlight w:val="yellow"/>
           <w:lang w:val="es-419"/>
         </w:rPr>
         <w:t>19 de noviembre</w:t>
@@ -1291,7 +1180,7 @@
           <w:szCs w:val="24"/>
           <w:lang w:val="es-ES"/>
         </w:rPr>
-        <w:t xml:space="preserve"> (Ingresado manualmente por el CI)</w:t>
+        <w:t xml:space="preserve"> </w:t>
       </w:r>
     </w:p>
     <w:p>
@@ -1348,7 +1237,7 @@
           <w:szCs w:val="24"/>
           <w:lang w:val="es-ES"/>
         </w:rPr>
-        <w:t xml:space="preserve"> (Generado por el sistema)</w:t>
+        <w:t xml:space="preserve"> </w:t>
       </w:r>
     </w:p>
     <w:p>
@@ -1924,18 +1813,6 @@
           <w:lang w:val="es-419"/>
         </w:rPr>
         <w:t xml:space="preserve"> </w:t>
-      </w:r>
-      <w:r>
-        <w:rPr>
-          <w:rFonts w:ascii="Segoe UI" w:hAnsi="Segoe UI" w:cs="Segoe UI"/>
-          <w:b/>
-          <w:bCs/>
-          <w:color w:val="002060"/>
-          <w:sz w:val="24"/>
-          <w:szCs w:val="24"/>
-          <w:lang w:val="es-ES"/>
-        </w:rPr>
-        <w:t>(Generado por el sistema)</w:t>
       </w:r>
     </w:p>
     <w:p>
@@ -6703,18 +6580,6 @@
         </w:rPr>
         <w:t xml:space="preserve">CONCLUSIONES </w:t>
       </w:r>
-      <w:r>
-        <w:rPr>
-          <w:rFonts w:ascii="Segoe UI" w:hAnsi="Segoe UI" w:cs="Segoe UI"/>
-          <w:b/>
-          <w:bCs/>
-          <w:color w:val="002060"/>
-          <w:sz w:val="24"/>
-          <w:szCs w:val="24"/>
-          <w:lang w:val="es-ES"/>
-        </w:rPr>
-        <w:t>(Ingresado manualmente por el CI)</w:t>
-      </w:r>
     </w:p>
     <w:p>
       <w:pPr>
@@ -6792,7 +6657,6 @@
           <w:lang w:val="es-419"/>
         </w:rPr>
       </w:pPr>
-      <w:proofErr w:type="gramStart"/>
       <w:r>
         <w:rPr>
           <w:rFonts w:ascii="Segoe UI" w:hAnsi="Segoe UI" w:cs="Segoe UI"/>
@@ -6803,31 +6667,6 @@
           <w:lang w:val="es-ES"/>
         </w:rPr>
         <w:t>ANEXOS</w:t>
-      </w:r>
-      <w:r>
-        <w:rPr>
-          <w:rFonts w:ascii="Segoe UI" w:hAnsi="Segoe UI" w:cs="Segoe UI"/>
-          <w:b/>
-          <w:bCs/>
-          <w:color w:val="002060"/>
-          <w:sz w:val="24"/>
-          <w:szCs w:val="24"/>
-          <w:lang w:val="es-ES"/>
-        </w:rPr>
-        <w:t>(</w:t>
-      </w:r>
-      <w:proofErr w:type="gramEnd"/>
-      <w:r>
-        <w:rPr>
-          <w:rFonts w:ascii="Segoe UI" w:hAnsi="Segoe UI" w:cs="Segoe UI"/>
-          <w:b/>
-          <w:bCs/>
-          <w:color w:val="002060"/>
-          <w:sz w:val="24"/>
-          <w:szCs w:val="24"/>
-          <w:lang w:val="es-ES"/>
-        </w:rPr>
-        <w:t>Ingresado manualmente por el CI)</w:t>
       </w:r>
     </w:p>
     <w:p>
@@ -8013,6 +7852,7 @@
     <w:lsdException w:name="HTML Sample" w:semiHidden="1" w:unhideWhenUsed="1"/>
     <w:lsdException w:name="HTML Typewriter" w:semiHidden="1" w:unhideWhenUsed="1"/>
     <w:lsdException w:name="HTML Variable" w:semiHidden="1" w:unhideWhenUsed="1"/>
+    <w:lsdException w:name="Normal Table" w:semiHidden="1" w:unhideWhenUsed="1"/>
     <w:lsdException w:name="annotation subject" w:semiHidden="1" w:unhideWhenUsed="1"/>
     <w:lsdException w:name="No List" w:semiHidden="1" w:unhideWhenUsed="1"/>
     <w:lsdException w:name="Outline List 1" w:semiHidden="1" w:unhideWhenUsed="1"/>
@@ -8059,8 +7899,10 @@
     <w:lsdException w:name="Table Subtle 2" w:semiHidden="1" w:unhideWhenUsed="1"/>
     <w:lsdException w:name="Table Web 1" w:semiHidden="1" w:unhideWhenUsed="1"/>
     <w:lsdException w:name="Table Web 2" w:semiHidden="1" w:unhideWhenUsed="1"/>
+    <w:lsdException w:name="Table Web 3" w:semiHidden="1" w:unhideWhenUsed="1"/>
     <w:lsdException w:name="Balloon Text" w:semiHidden="1" w:unhideWhenUsed="1"/>
     <w:lsdException w:name="Table Grid" w:uiPriority="39"/>
+    <w:lsdException w:name="Table Theme" w:semiHidden="1" w:unhideWhenUsed="1"/>
     <w:lsdException w:name="Placeholder Text" w:semiHidden="1"/>
     <w:lsdException w:name="No Spacing" w:uiPriority="1" w:qFormat="1"/>
     <w:lsdException w:name="Light Shading" w:uiPriority="60"/>

</xml_diff>